<commit_message>
Added response to reviewers
</commit_message>
<xml_diff>
--- a/_extensions/apaquarto/apaquarto.docx
+++ b/_extensions/apaquarto/apaquarto.docx
@@ -1999,6 +1999,80 @@
       <w:szCs w:val="20"/>
     </w:rPr>
   </w:style>
+  <w:style w:type="paragraph" w:styleId="ReviewerComment">
+    <w:name w:val="ReviewerComment"/>
+    <w:basedOn w:val="BodyText"/>
+    <w:next w:val="BodyText"/>
+    <w:qFormat/>
+    <w:pPr>
+      <w:pBdr>
+        <w:left w:val="single" w:sz="24" w:space="6" w:color="34618E"/>
+      </w:pBdr>
+      <w:shd w:val="clear" w:color="auto" w:fill="EAF1F8"/>
+      <w:spacing w:before="120" w:after="120"/>
+      <w:ind w:left="144" w:right="144" w:firstLine="0"/>
+    </w:pPr>
+  </w:style>
+  <w:style w:type="paragraph" w:styleId="AuthorResponse">
+    <w:name w:val="AuthorResponse"/>
+    <w:basedOn w:val="BodyText"/>
+    <w:next w:val="BodyText"/>
+    <w:qFormat/>
+    <w:pPr>
+      <w:pBdr>
+        <w:left w:val="single" w:sz="24" w:space="6" w:color="3E7D54"/>
+      </w:pBdr>
+      <w:shd w:val="clear" w:color="auto" w:fill="EAF3EC"/>
+      <w:spacing w:before="120" w:after="120"/>
+      <w:ind w:left="144" w:right="144" w:firstLine="0"/>
+    </w:pPr>
+  </w:style>
+  <w:style w:type="paragraph" w:styleId="ManuscriptChange">
+    <w:name w:val="ManuscriptChange"/>
+    <w:basedOn w:val="BodyText"/>
+    <w:next w:val="BodyText"/>
+    <w:qFormat/>
+    <w:pPr>
+      <w:pBdr>
+        <w:left w:val="single" w:sz="24" w:space="6" w:color="B5732E"/>
+      </w:pBdr>
+      <w:shd w:val="clear" w:color="auto" w:fill="FBF1E6"/>
+      <w:spacing w:before="120" w:after="120"/>
+      <w:ind w:left="144" w:right="144" w:firstLine="0"/>
+    </w:pPr>
+  </w:style>
+  <w:style w:type="paragraph" w:styleId="ReviewSectionHeading">
+    <w:name w:val="ReviewSectionHeading"/>
+    <w:basedOn w:val="Heading1"/>
+    <w:next w:val="BodyText"/>
+    <w:qFormat/>
+    <w:pPr>
+      <w:keepNext/>
+      <w:keepLines/>
+      <w:spacing w:before="240" w:after="120"/>
+      <w:jc w:val="center"/>
+      <w:outlineLvl w:val="0"/>
+    </w:pPr>
+    <w:rPr>
+      <w:b/>
+      <w:bCs/>
+      <w:sz w:val="32"/>
+      <w:szCs w:val="32"/>
+      <w:u w:val="single"/>
+    </w:rPr>
+  </w:style>
+  <w:style w:type="paragraph" w:styleId="ReviewSubHeading">
+    <w:name w:val="ReviewSubHeading"/>
+    <w:basedOn w:val="Heading2"/>
+    <w:next w:val="BodyText"/>
+    <w:qFormat/>
+    <w:pPr>
+      <w:keepNext/>
+      <w:keepLines/>
+      <w:spacing w:before="240" w:after="60"/>
+      <w:outlineLvl w:val="1"/>
+    </w:pPr>
+  </w:style>
 </w:styles>
 </file>
 

</xml_diff>